<commit_message>
Add authenticated job creation endpoint
Allow employers to create jobs using their authenticated identity, validate the request, and return the saved job details. Persist jobs asynchronously.
</commit_message>
<xml_diff>
--- a/docs/Word Documentations/JWT Concepts.docx
+++ b/docs/Word Documentations/JWT Concepts.docx
@@ -14,6 +14,8 @@
           <w:szCs w:val="27"/>
         </w:rPr>
       </w:pPr>
+      <w:bookmarkStart w:id="0" w:name="_GoBack"/>
+      <w:bookmarkEnd w:id="0"/>
       <w:r>
         <w:rPr>
           <w:rFonts w:ascii="Times New Roman" w:eastAsia="Times New Roman" w:hAnsi="Times New Roman" w:cs="Times New Roman"/>
@@ -133,8 +135,20 @@
                 <w:sz w:val="24"/>
                 <w:szCs w:val="24"/>
               </w:rPr>
-              <w:t>Your JobBoard</w:t>
+              <w:t xml:space="preserve">Your </w:t>
             </w:r>
+            <w:proofErr w:type="spellStart"/>
+            <w:r>
+              <w:rPr>
+                <w:rFonts w:ascii="Times New Roman" w:eastAsia="Times New Roman" w:hAnsi="Times New Roman" w:cs="Times New Roman"/>
+                <w:b/>
+                <w:bCs/>
+                <w:sz w:val="24"/>
+                <w:szCs w:val="24"/>
+              </w:rPr>
+              <w:t>JobBoard</w:t>
+            </w:r>
+            <w:proofErr w:type="spellEnd"/>
           </w:p>
         </w:tc>
       </w:tr>
@@ -217,6 +231,7 @@
               </w:rPr>
               <w:t xml:space="preserve">Your API, e.g. </w:t>
             </w:r>
+            <w:proofErr w:type="spellStart"/>
             <w:r>
               <w:rPr>
                 <w:rFonts w:ascii="Courier New" w:eastAsia="Times New Roman" w:hAnsi="Courier New" w:cs="Courier New"/>
@@ -225,6 +240,7 @@
               </w:rPr>
               <w:t>JobBoardAPI</w:t>
             </w:r>
+            <w:proofErr w:type="spellEnd"/>
           </w:p>
         </w:tc>
       </w:tr>
@@ -411,6 +427,7 @@
                 <w:szCs w:val="24"/>
               </w:rPr>
             </w:pPr>
+            <w:proofErr w:type="spellStart"/>
             <w:r>
               <w:rPr>
                 <w:rFonts w:ascii="Times New Roman" w:eastAsia="Times New Roman" w:hAnsi="Times New Roman" w:cs="Times New Roman"/>
@@ -421,6 +438,7 @@
               </w:rPr>
               <w:t>NotBefore</w:t>
             </w:r>
+            <w:proofErr w:type="spellEnd"/>
           </w:p>
         </w:tc>
         <w:tc>
@@ -471,6 +489,7 @@
               </w:rPr>
               <w:t xml:space="preserve">Usually </w:t>
             </w:r>
+            <w:proofErr w:type="spellStart"/>
             <w:r>
               <w:rPr>
                 <w:rFonts w:ascii="Courier New" w:eastAsia="Times New Roman" w:hAnsi="Courier New" w:cs="Courier New"/>
@@ -479,6 +498,7 @@
               </w:rPr>
               <w:t>DateTime.UtcNow</w:t>
             </w:r>
+            <w:proofErr w:type="spellEnd"/>
           </w:p>
         </w:tc>
       </w:tr>
@@ -647,13 +667,889 @@
         </w:tc>
       </w:tr>
     </w:tbl>
-    <w:p>
-      <w:r>
-        <w:t>v</w:t>
-      </w:r>
-      <w:bookmarkStart w:id="0" w:name="_GoBack"/>
-      <w:bookmarkEnd w:id="0"/>
-    </w:p>
+    <w:p/>
+    <w:p/>
+    <w:p/>
+    <w:p>
+      <w:pPr>
+        <w:pStyle w:val="NormalWeb"/>
+      </w:pPr>
+      <w:r>
+        <w:t>Json Web Token Concepts:</w:t>
+      </w:r>
+      <w:r>
+        <w:br/>
+      </w:r>
+      <w:r>
+        <w:rPr>
+          <w:b/>
+        </w:rPr>
+        <w:t>Claims:</w:t>
+      </w:r>
+      <w:r>
+        <w:br/>
+        <w:t xml:space="preserve">The things (email, password, roles </w:t>
+      </w:r>
+      <w:proofErr w:type="spellStart"/>
+      <w:r>
+        <w:t>etc</w:t>
+      </w:r>
+      <w:proofErr w:type="spellEnd"/>
+      <w:r>
+        <w:t>) with which the user will claim that he has the authority to access certain pages in certain way.</w:t>
+      </w:r>
+      <w:r>
+        <w:br/>
+      </w:r>
+      <w:r>
+        <w:rPr>
+          <w:b/>
+        </w:rPr>
+        <w:t>Issuer:</w:t>
+      </w:r>
+      <w:r>
+        <w:br/>
+        <w:t xml:space="preserve">Who allowed the user to Claim the Claims for example my </w:t>
+      </w:r>
+      <w:proofErr w:type="spellStart"/>
+      <w:r>
+        <w:t>api</w:t>
+      </w:r>
+      <w:proofErr w:type="spellEnd"/>
+      <w:r>
+        <w:t xml:space="preserve"> (</w:t>
+      </w:r>
+      <w:proofErr w:type="spellStart"/>
+      <w:r>
+        <w:t>Jobboard</w:t>
+      </w:r>
+      <w:proofErr w:type="spellEnd"/>
+      <w:r>
+        <w:t xml:space="preserve"> </w:t>
+      </w:r>
+      <w:proofErr w:type="spellStart"/>
+      <w:r>
+        <w:t>Api</w:t>
+      </w:r>
+      <w:proofErr w:type="spellEnd"/>
+      <w:r>
+        <w:t>)</w:t>
+      </w:r>
+      <w:r>
+        <w:br/>
+      </w:r>
+      <w:r>
+        <w:rPr>
+          <w:b/>
+        </w:rPr>
+        <w:t>Audience:</w:t>
+      </w:r>
+      <w:r>
+        <w:t xml:space="preserve"> </w:t>
+      </w:r>
+      <w:r>
+        <w:br/>
+        <w:t xml:space="preserve">The user is claiming to access what information? For </w:t>
+      </w:r>
+      <w:proofErr w:type="gramStart"/>
+      <w:r>
+        <w:t>example</w:t>
+      </w:r>
+      <w:proofErr w:type="gramEnd"/>
+      <w:r>
+        <w:t xml:space="preserve"> any </w:t>
+      </w:r>
+      <w:proofErr w:type="spellStart"/>
+      <w:r>
+        <w:t>api</w:t>
+      </w:r>
+      <w:proofErr w:type="spellEnd"/>
+      <w:r>
+        <w:t xml:space="preserve"> such as (</w:t>
+      </w:r>
+      <w:proofErr w:type="spellStart"/>
+      <w:r>
+        <w:t>Jobboard</w:t>
+      </w:r>
+      <w:proofErr w:type="spellEnd"/>
+      <w:r>
+        <w:t xml:space="preserve"> </w:t>
+      </w:r>
+      <w:proofErr w:type="spellStart"/>
+      <w:r>
+        <w:t>Api</w:t>
+      </w:r>
+      <w:proofErr w:type="spellEnd"/>
+      <w:r>
+        <w:t>)</w:t>
+      </w:r>
+      <w:r>
+        <w:br/>
+      </w:r>
+      <w:proofErr w:type="spellStart"/>
+      <w:r>
+        <w:rPr>
+          <w:b/>
+        </w:rPr>
+        <w:t>NotBefore</w:t>
+      </w:r>
+      <w:proofErr w:type="spellEnd"/>
+      <w:r>
+        <w:rPr>
+          <w:b/>
+        </w:rPr>
+        <w:t>:</w:t>
+      </w:r>
+      <w:r>
+        <w:br/>
+        <w:t xml:space="preserve">When will the request will be granted access, </w:t>
+      </w:r>
+      <w:proofErr w:type="spellStart"/>
+      <w:r>
+        <w:t>eg</w:t>
+      </w:r>
+      <w:proofErr w:type="spellEnd"/>
+      <w:r>
+        <w:t xml:space="preserve"> time</w:t>
+      </w:r>
+      <w:r>
+        <w:br/>
+      </w:r>
+      <w:r>
+        <w:rPr>
+          <w:b/>
+        </w:rPr>
+        <w:t>Expires:</w:t>
+      </w:r>
+      <w:r>
+        <w:br/>
+        <w:t xml:space="preserve">When will the user be required to give the claims back again? </w:t>
+      </w:r>
+      <w:proofErr w:type="spellStart"/>
+      <w:r>
+        <w:t>Eg</w:t>
+      </w:r>
+      <w:proofErr w:type="spellEnd"/>
+      <w:r>
+        <w:t xml:space="preserve"> time</w:t>
+      </w:r>
+      <w:r>
+        <w:br/>
+      </w:r>
+      <w:r>
+        <w:rPr>
+          <w:b/>
+        </w:rPr>
+        <w:t>Secret key:</w:t>
+      </w:r>
+      <w:r>
+        <w:br/>
+        <w:t xml:space="preserve">A Secret Password that only my </w:t>
+      </w:r>
+      <w:proofErr w:type="spellStart"/>
+      <w:r>
+        <w:t>api</w:t>
+      </w:r>
+      <w:proofErr w:type="spellEnd"/>
+      <w:r>
+        <w:t xml:space="preserve"> will have access to and using this password the system is going to verify that my </w:t>
+      </w:r>
+      <w:proofErr w:type="spellStart"/>
+      <w:r>
+        <w:t>api</w:t>
+      </w:r>
+      <w:proofErr w:type="spellEnd"/>
+      <w:r>
+        <w:t xml:space="preserve"> is the one making the call </w:t>
+      </w:r>
+      <w:r>
+        <w:br/>
+      </w:r>
+      <w:r>
+        <w:rPr>
+          <w:b/>
+        </w:rPr>
+        <w:t>Signing Credentials:</w:t>
+      </w:r>
+      <w:r>
+        <w:br/>
+        <w:t xml:space="preserve">Using the Secret Key the System is going to put a signature of approval on the request that it was made by the right </w:t>
+      </w:r>
+      <w:proofErr w:type="spellStart"/>
+      <w:r>
+        <w:t>api</w:t>
+      </w:r>
+      <w:proofErr w:type="spellEnd"/>
+      <w:r>
+        <w:t xml:space="preserve"> after the verification of </w:t>
+      </w:r>
+      <w:proofErr w:type="spellStart"/>
+      <w:r>
+        <w:t>Api</w:t>
+      </w:r>
+      <w:proofErr w:type="spellEnd"/>
+      <w:r>
+        <w:br/>
+      </w:r>
+      <w:r>
+        <w:br/>
+      </w:r>
+      <w:r>
+        <w:br/>
+      </w:r>
+      <w:r>
+        <w:rPr>
+          <w:b/>
+        </w:rPr>
+        <w:t>Corrections:</w:t>
+      </w:r>
+      <w:r>
+        <w:rPr>
+          <w:b/>
+        </w:rPr>
+        <w:br/>
+      </w:r>
+      <w:r>
+        <w:t>Your understanding is taking shape. Just tighten these points:</w:t>
+      </w:r>
+    </w:p>
+    <w:p>
+      <w:pPr>
+        <w:pStyle w:val="NormalWeb"/>
+        <w:numPr>
+          <w:ilvl w:val="0"/>
+          <w:numId w:val="1"/>
+        </w:numPr>
+      </w:pPr>
+      <w:r>
+        <w:t>Claims: Information about the authenticated user, such as user ID, email, and role. Don't put their password in the JWT.</w:t>
+      </w:r>
+    </w:p>
+    <w:p>
+      <w:pPr>
+        <w:pStyle w:val="NormalWeb"/>
+        <w:numPr>
+          <w:ilvl w:val="0"/>
+          <w:numId w:val="1"/>
+        </w:numPr>
+      </w:pPr>
+      <w:r>
+        <w:t xml:space="preserve">Issuer: The system that issued the token — your </w:t>
+      </w:r>
+      <w:proofErr w:type="spellStart"/>
+      <w:r>
+        <w:t>JobBoard</w:t>
+      </w:r>
+      <w:proofErr w:type="spellEnd"/>
+      <w:r>
+        <w:t xml:space="preserve"> API.</w:t>
+      </w:r>
+    </w:p>
+    <w:p>
+      <w:pPr>
+        <w:pStyle w:val="NormalWeb"/>
+        <w:numPr>
+          <w:ilvl w:val="0"/>
+          <w:numId w:val="1"/>
+        </w:numPr>
+      </w:pPr>
+      <w:r>
+        <w:t>Audience: The API the token is intended to be used with.</w:t>
+      </w:r>
+    </w:p>
+    <w:p>
+      <w:pPr>
+        <w:pStyle w:val="NormalWeb"/>
+        <w:numPr>
+          <w:ilvl w:val="0"/>
+          <w:numId w:val="1"/>
+        </w:numPr>
+      </w:pPr>
+      <w:proofErr w:type="spellStart"/>
+      <w:r>
+        <w:t>NotBefore</w:t>
+      </w:r>
+      <w:proofErr w:type="spellEnd"/>
+      <w:r>
+        <w:t>: The time before which the token is invalid.</w:t>
+      </w:r>
+    </w:p>
+    <w:p>
+      <w:pPr>
+        <w:pStyle w:val="NormalWeb"/>
+        <w:numPr>
+          <w:ilvl w:val="0"/>
+          <w:numId w:val="1"/>
+        </w:numPr>
+      </w:pPr>
+      <w:r>
+        <w:lastRenderedPageBreak/>
+        <w:t>Expires: The time after which the token is invalid.</w:t>
+      </w:r>
+    </w:p>
+    <w:p>
+      <w:pPr>
+        <w:pStyle w:val="NormalWeb"/>
+        <w:numPr>
+          <w:ilvl w:val="0"/>
+          <w:numId w:val="1"/>
+        </w:numPr>
+      </w:pPr>
+      <w:r>
+        <w:t>Secret key: A secret value your API uses to sign the token and verify its signature.</w:t>
+      </w:r>
+    </w:p>
+    <w:p>
+      <w:pPr>
+        <w:pStyle w:val="NormalWeb"/>
+        <w:numPr>
+          <w:ilvl w:val="0"/>
+          <w:numId w:val="1"/>
+        </w:numPr>
+      </w:pPr>
+      <w:r>
+        <w:t>Signing credentials: The key and signing algorithm used to create the token's signature.</w:t>
+      </w:r>
+    </w:p>
+    <w:p>
+      <w:pPr>
+        <w:pStyle w:val="NormalWeb"/>
+      </w:pPr>
+      <w:r>
+        <w:t>One important distinction: the token is issued after the API verifies the user's credentials. The signature lets the API detect tampering; it doesn't independently prove that a user was allowed to log in.</w:t>
+      </w:r>
+    </w:p>
+    <w:p>
+      <w:pPr>
+        <w:spacing w:before="100" w:beforeAutospacing="1" w:after="100" w:afterAutospacing="1" w:line="240" w:lineRule="auto"/>
+        <w:rPr>
+          <w:rFonts w:ascii="Times New Roman" w:eastAsia="Times New Roman" w:hAnsi="Times New Roman" w:cs="Times New Roman"/>
+          <w:sz w:val="24"/>
+          <w:szCs w:val="24"/>
+        </w:rPr>
+      </w:pPr>
+      <w:r>
+        <w:rPr>
+          <w:rFonts w:ascii="Times New Roman" w:eastAsia="Times New Roman" w:hAnsi="Times New Roman" w:cs="Times New Roman"/>
+          <w:sz w:val="24"/>
+          <w:szCs w:val="24"/>
+        </w:rPr>
+        <w:t>Bro, that's a fair question. I was telling you what to type without explaining how you were supposed to know what the class needs. Let's fix that.</w:t>
+      </w:r>
+    </w:p>
+    <w:p>
+      <w:pPr>
+        <w:spacing w:before="100" w:beforeAutospacing="1" w:after="100" w:afterAutospacing="1" w:line="240" w:lineRule="auto"/>
+        <w:outlineLvl w:val="2"/>
+        <w:rPr>
+          <w:rFonts w:ascii="Times New Roman" w:eastAsia="Times New Roman" w:hAnsi="Times New Roman" w:cs="Times New Roman"/>
+          <w:b/>
+          <w:bCs/>
+          <w:sz w:val="27"/>
+          <w:szCs w:val="27"/>
+        </w:rPr>
+      </w:pPr>
+      <w:r>
+        <w:rPr>
+          <w:rFonts w:ascii="Times New Roman" w:eastAsia="Times New Roman" w:hAnsi="Times New Roman" w:cs="Times New Roman"/>
+          <w:b/>
+          <w:bCs/>
+          <w:sz w:val="27"/>
+          <w:szCs w:val="27"/>
+        </w:rPr>
+        <w:t>1. What is a security algorithm?</w:t>
+      </w:r>
+    </w:p>
+    <w:p>
+      <w:pPr>
+        <w:spacing w:before="100" w:beforeAutospacing="1" w:after="100" w:afterAutospacing="1" w:line="240" w:lineRule="auto"/>
+        <w:rPr>
+          <w:rFonts w:ascii="Times New Roman" w:eastAsia="Times New Roman" w:hAnsi="Times New Roman" w:cs="Times New Roman"/>
+          <w:sz w:val="24"/>
+          <w:szCs w:val="24"/>
+        </w:rPr>
+      </w:pPr>
+      <w:r>
+        <w:rPr>
+          <w:rFonts w:ascii="Times New Roman" w:eastAsia="Times New Roman" w:hAnsi="Times New Roman" w:cs="Times New Roman"/>
+          <w:sz w:val="24"/>
+          <w:szCs w:val="24"/>
+        </w:rPr>
+        <w:t>When your API signs a JWT, it needs a mathematical method to create the signature. That method is the signing algorithm.</w:t>
+      </w:r>
+    </w:p>
+    <w:p>
+      <w:pPr>
+        <w:spacing w:before="100" w:beforeAutospacing="1" w:after="100" w:afterAutospacing="1" w:line="240" w:lineRule="auto"/>
+        <w:rPr>
+          <w:rFonts w:ascii="Times New Roman" w:eastAsia="Times New Roman" w:hAnsi="Times New Roman" w:cs="Times New Roman"/>
+          <w:sz w:val="24"/>
+          <w:szCs w:val="24"/>
+        </w:rPr>
+      </w:pPr>
+      <w:r>
+        <w:rPr>
+          <w:rFonts w:ascii="Times New Roman" w:eastAsia="Times New Roman" w:hAnsi="Times New Roman" w:cs="Times New Roman"/>
+          <w:sz w:val="24"/>
+          <w:szCs w:val="24"/>
+        </w:rPr>
+        <w:t>Think of it like this:</w:t>
+      </w:r>
+    </w:p>
+    <w:p>
+      <w:pPr>
+        <w:numPr>
+          <w:ilvl w:val="0"/>
+          <w:numId w:val="2"/>
+        </w:numPr>
+        <w:spacing w:before="100" w:beforeAutospacing="1" w:after="100" w:afterAutospacing="1" w:line="240" w:lineRule="auto"/>
+        <w:rPr>
+          <w:rFonts w:ascii="Times New Roman" w:eastAsia="Times New Roman" w:hAnsi="Times New Roman" w:cs="Times New Roman"/>
+          <w:sz w:val="24"/>
+          <w:szCs w:val="24"/>
+        </w:rPr>
+      </w:pPr>
+      <w:r>
+        <w:rPr>
+          <w:rFonts w:ascii="Times New Roman" w:eastAsia="Times New Roman" w:hAnsi="Times New Roman" w:cs="Times New Roman"/>
+          <w:sz w:val="24"/>
+          <w:szCs w:val="24"/>
+        </w:rPr>
+        <w:t>Secret key: Your private secret.</w:t>
+      </w:r>
+    </w:p>
+    <w:p>
+      <w:pPr>
+        <w:numPr>
+          <w:ilvl w:val="0"/>
+          <w:numId w:val="2"/>
+        </w:numPr>
+        <w:spacing w:before="100" w:beforeAutospacing="1" w:after="100" w:afterAutospacing="1" w:line="240" w:lineRule="auto"/>
+        <w:rPr>
+          <w:rFonts w:ascii="Times New Roman" w:eastAsia="Times New Roman" w:hAnsi="Times New Roman" w:cs="Times New Roman"/>
+          <w:sz w:val="24"/>
+          <w:szCs w:val="24"/>
+        </w:rPr>
+      </w:pPr>
+      <w:r>
+        <w:rPr>
+          <w:rFonts w:ascii="Times New Roman" w:eastAsia="Times New Roman" w:hAnsi="Times New Roman" w:cs="Times New Roman"/>
+          <w:sz w:val="24"/>
+          <w:szCs w:val="24"/>
+        </w:rPr>
+        <w:t>Security algorithm: The mathematical method that uses the secret.</w:t>
+      </w:r>
+    </w:p>
+    <w:p>
+      <w:pPr>
+        <w:numPr>
+          <w:ilvl w:val="0"/>
+          <w:numId w:val="2"/>
+        </w:numPr>
+        <w:spacing w:before="100" w:beforeAutospacing="1" w:after="100" w:afterAutospacing="1" w:line="240" w:lineRule="auto"/>
+        <w:rPr>
+          <w:rFonts w:ascii="Times New Roman" w:eastAsia="Times New Roman" w:hAnsi="Times New Roman" w:cs="Times New Roman"/>
+          <w:sz w:val="24"/>
+          <w:szCs w:val="24"/>
+        </w:rPr>
+      </w:pPr>
+      <w:r>
+        <w:rPr>
+          <w:rFonts w:ascii="Times New Roman" w:eastAsia="Times New Roman" w:hAnsi="Times New Roman" w:cs="Times New Roman"/>
+          <w:sz w:val="24"/>
+          <w:szCs w:val="24"/>
+        </w:rPr>
+        <w:t>Signing credentials: The combination of the key and the algorithm.</w:t>
+      </w:r>
+    </w:p>
+    <w:p>
+      <w:pPr>
+        <w:numPr>
+          <w:ilvl w:val="0"/>
+          <w:numId w:val="2"/>
+        </w:numPr>
+        <w:spacing w:before="100" w:beforeAutospacing="1" w:after="100" w:afterAutospacing="1" w:line="240" w:lineRule="auto"/>
+        <w:rPr>
+          <w:rFonts w:ascii="Times New Roman" w:eastAsia="Times New Roman" w:hAnsi="Times New Roman" w:cs="Times New Roman"/>
+          <w:sz w:val="24"/>
+          <w:szCs w:val="24"/>
+        </w:rPr>
+      </w:pPr>
+      <w:r>
+        <w:rPr>
+          <w:rFonts w:ascii="Times New Roman" w:eastAsia="Times New Roman" w:hAnsi="Times New Roman" w:cs="Times New Roman"/>
+          <w:sz w:val="24"/>
+          <w:szCs w:val="24"/>
+        </w:rPr>
+        <w:t>JWT signature: The result used to detect whether the token was tampered with.</w:t>
+      </w:r>
+    </w:p>
+    <w:p>
+      <w:pPr>
+        <w:spacing w:before="100" w:beforeAutospacing="1" w:after="100" w:afterAutospacing="1" w:line="240" w:lineRule="auto"/>
+        <w:outlineLvl w:val="2"/>
+        <w:rPr>
+          <w:rFonts w:ascii="Times New Roman" w:eastAsia="Times New Roman" w:hAnsi="Times New Roman" w:cs="Times New Roman"/>
+          <w:b/>
+          <w:bCs/>
+          <w:sz w:val="27"/>
+          <w:szCs w:val="27"/>
+        </w:rPr>
+      </w:pPr>
+      <w:r>
+        <w:rPr>
+          <w:rFonts w:ascii="Times New Roman" w:eastAsia="Times New Roman" w:hAnsi="Times New Roman" w:cs="Times New Roman"/>
+          <w:b/>
+          <w:bCs/>
+          <w:sz w:val="27"/>
+          <w:szCs w:val="27"/>
+        </w:rPr>
+        <w:t>2. What is HMAC-SHA256?</w:t>
+      </w:r>
+    </w:p>
+    <w:p>
+      <w:pPr>
+        <w:spacing w:before="100" w:beforeAutospacing="1" w:after="100" w:afterAutospacing="1" w:line="240" w:lineRule="auto"/>
+        <w:rPr>
+          <w:rFonts w:ascii="Times New Roman" w:eastAsia="Times New Roman" w:hAnsi="Times New Roman" w:cs="Times New Roman"/>
+          <w:sz w:val="24"/>
+          <w:szCs w:val="24"/>
+        </w:rPr>
+      </w:pPr>
+      <w:r>
+        <w:rPr>
+          <w:rFonts w:ascii="Times New Roman" w:eastAsia="Times New Roman" w:hAnsi="Times New Roman" w:cs="Times New Roman"/>
+          <w:sz w:val="24"/>
+          <w:szCs w:val="24"/>
+        </w:rPr>
+        <w:t>It's a specific signing algorithm:</w:t>
+      </w:r>
+    </w:p>
+    <w:p>
+      <w:pPr>
+        <w:numPr>
+          <w:ilvl w:val="0"/>
+          <w:numId w:val="3"/>
+        </w:numPr>
+        <w:spacing w:before="100" w:beforeAutospacing="1" w:after="100" w:afterAutospacing="1" w:line="240" w:lineRule="auto"/>
+        <w:rPr>
+          <w:rFonts w:ascii="Times New Roman" w:eastAsia="Times New Roman" w:hAnsi="Times New Roman" w:cs="Times New Roman"/>
+          <w:sz w:val="24"/>
+          <w:szCs w:val="24"/>
+        </w:rPr>
+      </w:pPr>
+      <w:r>
+        <w:rPr>
+          <w:rFonts w:ascii="Times New Roman" w:eastAsia="Times New Roman" w:hAnsi="Times New Roman" w:cs="Times New Roman"/>
+          <w:sz w:val="24"/>
+          <w:szCs w:val="24"/>
+        </w:rPr>
+        <w:t>HMAC: Uses a secret key to create and verify a message authentication code.</w:t>
+      </w:r>
+    </w:p>
+    <w:p>
+      <w:pPr>
+        <w:numPr>
+          <w:ilvl w:val="0"/>
+          <w:numId w:val="3"/>
+        </w:numPr>
+        <w:spacing w:before="100" w:beforeAutospacing="1" w:after="100" w:afterAutospacing="1" w:line="240" w:lineRule="auto"/>
+        <w:rPr>
+          <w:rFonts w:ascii="Times New Roman" w:eastAsia="Times New Roman" w:hAnsi="Times New Roman" w:cs="Times New Roman"/>
+          <w:sz w:val="24"/>
+          <w:szCs w:val="24"/>
+        </w:rPr>
+      </w:pPr>
+      <w:r>
+        <w:rPr>
+          <w:rFonts w:ascii="Times New Roman" w:eastAsia="Times New Roman" w:hAnsi="Times New Roman" w:cs="Times New Roman"/>
+          <w:sz w:val="24"/>
+          <w:szCs w:val="24"/>
+        </w:rPr>
+        <w:t>SHA-256: The hash function used inside HMAC.</w:t>
+      </w:r>
+    </w:p>
+    <w:p>
+      <w:pPr>
+        <w:spacing w:before="100" w:beforeAutospacing="1" w:after="100" w:afterAutospacing="1" w:line="240" w:lineRule="auto"/>
+        <w:rPr>
+          <w:rFonts w:ascii="Times New Roman" w:eastAsia="Times New Roman" w:hAnsi="Times New Roman" w:cs="Times New Roman"/>
+          <w:sz w:val="24"/>
+          <w:szCs w:val="24"/>
+        </w:rPr>
+      </w:pPr>
+      <w:r>
+        <w:rPr>
+          <w:rFonts w:ascii="Times New Roman" w:eastAsia="Times New Roman" w:hAnsi="Times New Roman" w:cs="Times New Roman"/>
+          <w:sz w:val="24"/>
+          <w:szCs w:val="24"/>
+        </w:rPr>
+        <w:t>Your API uses the secret key and HMAC-SHA256 to sign the token. Later, when a protected endpoint receives that token, the API can verify its signature using the same secret key.</w:t>
+      </w:r>
+    </w:p>
+    <w:p>
+      <w:pPr>
+        <w:spacing w:before="100" w:beforeAutospacing="1" w:after="100" w:afterAutospacing="1" w:line="240" w:lineRule="auto"/>
+        <w:rPr>
+          <w:rFonts w:ascii="Times New Roman" w:eastAsia="Times New Roman" w:hAnsi="Times New Roman" w:cs="Times New Roman"/>
+          <w:sz w:val="24"/>
+          <w:szCs w:val="24"/>
+        </w:rPr>
+      </w:pPr>
+      <w:r>
+        <w:rPr>
+          <w:rFonts w:ascii="Times New Roman" w:eastAsia="Times New Roman" w:hAnsi="Times New Roman" w:cs="Times New Roman"/>
+          <w:sz w:val="24"/>
+          <w:szCs w:val="24"/>
+        </w:rPr>
+        <w:t xml:space="preserve">If somebody changes a claim from </w:t>
+      </w:r>
+      <w:r>
+        <w:rPr>
+          <w:rFonts w:ascii="Courier New" w:eastAsia="Times New Roman" w:hAnsi="Courier New" w:cs="Courier New"/>
+          <w:sz w:val="20"/>
+          <w:szCs w:val="20"/>
+        </w:rPr>
+        <w:t xml:space="preserve">Role: </w:t>
+      </w:r>
+      <w:proofErr w:type="spellStart"/>
+      <w:r>
+        <w:rPr>
+          <w:rFonts w:ascii="Courier New" w:eastAsia="Times New Roman" w:hAnsi="Courier New" w:cs="Courier New"/>
+          <w:sz w:val="20"/>
+          <w:szCs w:val="20"/>
+        </w:rPr>
+        <w:t>JobSeeker</w:t>
+      </w:r>
+      <w:proofErr w:type="spellEnd"/>
+      <w:r>
+        <w:rPr>
+          <w:rFonts w:ascii="Times New Roman" w:eastAsia="Times New Roman" w:hAnsi="Times New Roman" w:cs="Times New Roman"/>
+          <w:sz w:val="24"/>
+          <w:szCs w:val="24"/>
+        </w:rPr>
+        <w:t xml:space="preserve"> to </w:t>
+      </w:r>
+      <w:r>
+        <w:rPr>
+          <w:rFonts w:ascii="Courier New" w:eastAsia="Times New Roman" w:hAnsi="Courier New" w:cs="Courier New"/>
+          <w:sz w:val="20"/>
+          <w:szCs w:val="20"/>
+        </w:rPr>
+        <w:t>Role: Admin</w:t>
+      </w:r>
+      <w:r>
+        <w:rPr>
+          <w:rFonts w:ascii="Times New Roman" w:eastAsia="Times New Roman" w:hAnsi="Times New Roman" w:cs="Times New Roman"/>
+          <w:sz w:val="24"/>
+          <w:szCs w:val="24"/>
+        </w:rPr>
+        <w:t>, the signature won't match, and the API should reject the token.</w:t>
+      </w:r>
+    </w:p>
+    <w:p>
+      <w:pPr>
+        <w:spacing w:before="100" w:beforeAutospacing="1" w:after="100" w:afterAutospacing="1" w:line="240" w:lineRule="auto"/>
+        <w:outlineLvl w:val="2"/>
+        <w:rPr>
+          <w:rFonts w:ascii="Times New Roman" w:eastAsia="Times New Roman" w:hAnsi="Times New Roman" w:cs="Times New Roman"/>
+          <w:b/>
+          <w:bCs/>
+          <w:sz w:val="27"/>
+          <w:szCs w:val="27"/>
+        </w:rPr>
+      </w:pPr>
+      <w:r>
+        <w:rPr>
+          <w:rFonts w:ascii="Times New Roman" w:eastAsia="Times New Roman" w:hAnsi="Times New Roman" w:cs="Times New Roman"/>
+          <w:b/>
+          <w:bCs/>
+          <w:sz w:val="27"/>
+          <w:szCs w:val="27"/>
+        </w:rPr>
+        <w:t>3. How were you supposed to know the constructor's requirements?</w:t>
+      </w:r>
+    </w:p>
+    <w:p>
+      <w:pPr>
+        <w:spacing w:before="100" w:beforeAutospacing="1" w:after="100" w:afterAutospacing="1" w:line="240" w:lineRule="auto"/>
+        <w:rPr>
+          <w:rFonts w:ascii="Times New Roman" w:eastAsia="Times New Roman" w:hAnsi="Times New Roman" w:cs="Times New Roman"/>
+          <w:sz w:val="24"/>
+          <w:szCs w:val="24"/>
+        </w:rPr>
+      </w:pPr>
+      <w:r>
+        <w:rPr>
+          <w:rFonts w:ascii="Times New Roman" w:eastAsia="Times New Roman" w:hAnsi="Times New Roman" w:cs="Times New Roman"/>
+          <w:sz w:val="24"/>
+          <w:szCs w:val="24"/>
+        </w:rPr>
+        <w:t>By checking the class documentation or IntelliSense—not by guessing.</w:t>
+      </w:r>
+    </w:p>
+    <w:p>
+      <w:pPr>
+        <w:spacing w:before="100" w:beforeAutospacing="1" w:after="100" w:afterAutospacing="1" w:line="240" w:lineRule="auto"/>
+        <w:rPr>
+          <w:rFonts w:ascii="Times New Roman" w:eastAsia="Times New Roman" w:hAnsi="Times New Roman" w:cs="Times New Roman"/>
+          <w:sz w:val="24"/>
+          <w:szCs w:val="24"/>
+        </w:rPr>
+      </w:pPr>
+      <w:proofErr w:type="spellStart"/>
+      <w:r>
+        <w:rPr>
+          <w:rFonts w:ascii="Courier New" w:eastAsia="Times New Roman" w:hAnsi="Courier New" w:cs="Courier New"/>
+          <w:sz w:val="20"/>
+          <w:szCs w:val="20"/>
+        </w:rPr>
+        <w:t>SigningCredentials</w:t>
+      </w:r>
+      <w:proofErr w:type="spellEnd"/>
+      <w:r>
+        <w:rPr>
+          <w:rFonts w:ascii="Times New Roman" w:eastAsia="Times New Roman" w:hAnsi="Times New Roman" w:cs="Times New Roman"/>
+          <w:sz w:val="24"/>
+          <w:szCs w:val="24"/>
+        </w:rPr>
+        <w:t xml:space="preserve"> needs two things:</w:t>
+      </w:r>
+    </w:p>
+    <w:p>
+      <w:pPr>
+        <w:numPr>
+          <w:ilvl w:val="0"/>
+          <w:numId w:val="4"/>
+        </w:numPr>
+        <w:spacing w:before="100" w:beforeAutospacing="1" w:after="100" w:afterAutospacing="1" w:line="240" w:lineRule="auto"/>
+        <w:rPr>
+          <w:rFonts w:ascii="Times New Roman" w:eastAsia="Times New Roman" w:hAnsi="Times New Roman" w:cs="Times New Roman"/>
+          <w:sz w:val="24"/>
+          <w:szCs w:val="24"/>
+        </w:rPr>
+      </w:pPr>
+      <w:r>
+        <w:rPr>
+          <w:rFonts w:ascii="Times New Roman" w:eastAsia="Times New Roman" w:hAnsi="Times New Roman" w:cs="Times New Roman"/>
+          <w:sz w:val="24"/>
+          <w:szCs w:val="24"/>
+        </w:rPr>
+        <w:t xml:space="preserve">A </w:t>
+      </w:r>
+      <w:proofErr w:type="spellStart"/>
+      <w:r>
+        <w:rPr>
+          <w:rFonts w:ascii="Courier New" w:eastAsia="Times New Roman" w:hAnsi="Courier New" w:cs="Courier New"/>
+          <w:sz w:val="20"/>
+          <w:szCs w:val="20"/>
+        </w:rPr>
+        <w:t>SecurityKey</w:t>
+      </w:r>
+      <w:proofErr w:type="spellEnd"/>
+      <w:r>
+        <w:rPr>
+          <w:rFonts w:ascii="Times New Roman" w:eastAsia="Times New Roman" w:hAnsi="Times New Roman" w:cs="Times New Roman"/>
+          <w:sz w:val="24"/>
+          <w:szCs w:val="24"/>
+        </w:rPr>
+        <w:t>, which tells it what secret/key to use.</w:t>
+      </w:r>
+    </w:p>
+    <w:p>
+      <w:pPr>
+        <w:numPr>
+          <w:ilvl w:val="0"/>
+          <w:numId w:val="4"/>
+        </w:numPr>
+        <w:spacing w:before="100" w:beforeAutospacing="1" w:after="100" w:afterAutospacing="1" w:line="240" w:lineRule="auto"/>
+        <w:rPr>
+          <w:rFonts w:ascii="Times New Roman" w:eastAsia="Times New Roman" w:hAnsi="Times New Roman" w:cs="Times New Roman"/>
+          <w:sz w:val="24"/>
+          <w:szCs w:val="24"/>
+        </w:rPr>
+      </w:pPr>
+      <w:r>
+        <w:rPr>
+          <w:rFonts w:ascii="Times New Roman" w:eastAsia="Times New Roman" w:hAnsi="Times New Roman" w:cs="Times New Roman"/>
+          <w:sz w:val="24"/>
+          <w:szCs w:val="24"/>
+        </w:rPr>
+        <w:t>A signing algorithm, which tells it how to create the signature.</w:t>
+      </w:r>
+    </w:p>
+    <w:p>
+      <w:pPr>
+        <w:spacing w:before="100" w:beforeAutospacing="1" w:after="100" w:afterAutospacing="1" w:line="240" w:lineRule="auto"/>
+        <w:rPr>
+          <w:rFonts w:ascii="Times New Roman" w:eastAsia="Times New Roman" w:hAnsi="Times New Roman" w:cs="Times New Roman"/>
+          <w:sz w:val="24"/>
+          <w:szCs w:val="24"/>
+        </w:rPr>
+      </w:pPr>
+      <w:r>
+        <w:rPr>
+          <w:rFonts w:ascii="Times New Roman" w:eastAsia="Times New Roman" w:hAnsi="Times New Roman" w:cs="Times New Roman"/>
+          <w:sz w:val="24"/>
+          <w:szCs w:val="24"/>
+        </w:rPr>
+        <w:lastRenderedPageBreak/>
+        <w:t xml:space="preserve">That's why the constructor accepts </w:t>
+      </w:r>
+      <w:proofErr w:type="spellStart"/>
+      <w:r>
+        <w:rPr>
+          <w:rFonts w:ascii="Courier New" w:eastAsia="Times New Roman" w:hAnsi="Courier New" w:cs="Courier New"/>
+          <w:sz w:val="20"/>
+          <w:szCs w:val="20"/>
+        </w:rPr>
+        <w:t>symmetricSecurityKey</w:t>
+      </w:r>
+      <w:proofErr w:type="spellEnd"/>
+      <w:r>
+        <w:rPr>
+          <w:rFonts w:ascii="Times New Roman" w:eastAsia="Times New Roman" w:hAnsi="Times New Roman" w:cs="Times New Roman"/>
+          <w:sz w:val="24"/>
+          <w:szCs w:val="24"/>
+        </w:rPr>
+        <w:t xml:space="preserve"> and </w:t>
+      </w:r>
+      <w:r>
+        <w:rPr>
+          <w:rFonts w:ascii="Courier New" w:eastAsia="Times New Roman" w:hAnsi="Courier New" w:cs="Courier New"/>
+          <w:sz w:val="20"/>
+          <w:szCs w:val="20"/>
+        </w:rPr>
+        <w:t>SecurityAlgorithms.HmacSha256</w:t>
+      </w:r>
+      <w:r>
+        <w:rPr>
+          <w:rFonts w:ascii="Times New Roman" w:eastAsia="Times New Roman" w:hAnsi="Times New Roman" w:cs="Times New Roman"/>
+          <w:sz w:val="24"/>
+          <w:szCs w:val="24"/>
+        </w:rPr>
+        <w:t>.</w:t>
+      </w:r>
+    </w:p>
+    <w:p>
+      <w:pPr>
+        <w:spacing w:before="100" w:beforeAutospacing="1" w:after="100" w:afterAutospacing="1" w:line="240" w:lineRule="auto"/>
+        <w:rPr>
+          <w:rFonts w:ascii="Times New Roman" w:eastAsia="Times New Roman" w:hAnsi="Times New Roman" w:cs="Times New Roman"/>
+          <w:sz w:val="24"/>
+          <w:szCs w:val="24"/>
+        </w:rPr>
+      </w:pPr>
+      <w:r>
+        <w:rPr>
+          <w:rFonts w:ascii="Times New Roman" w:eastAsia="Times New Roman" w:hAnsi="Times New Roman" w:cs="Times New Roman"/>
+          <w:sz w:val="24"/>
+          <w:szCs w:val="24"/>
+        </w:rPr>
+        <w:t>Your next step: Make that change and build the project. We haven't finished JWT generation yet, but you're now learning what each part actually does rather than just copying code.</w:t>
+      </w:r>
+    </w:p>
+    <w:p/>
     <w:sectPr>
       <w:pgSz w:w="12240" w:h="15840"/>
       <w:pgMar w:top="1440" w:right="1440" w:bottom="1440" w:left="1440" w:header="720" w:footer="720" w:gutter="0"/>
@@ -662,6 +1558,583 @@
     </w:sectPr>
   </w:body>
 </w:document>
+</file>
+
+<file path=word/numbering.xml><?xml version="1.0" encoding="utf-8"?>
+<w:numbering xmlns:wpc="http://schemas.microsoft.com/office/word/2010/wordprocessingCanvas" xmlns:cx="http://schemas.microsoft.com/office/drawing/2014/chartex" xmlns:cx1="http://schemas.microsoft.com/office/drawing/2015/9/8/chartex" xmlns:cx2="http://schemas.microsoft.com/office/drawing/2015/10/21/chartex" xmlns:cx3="http://schemas.microsoft.com/office/drawing/2016/5/9/chartex" xmlns:cx4="http://schemas.microsoft.com/office/drawing/2016/5/10/chartex" xmlns:cx5="http://schemas.microsoft.com/office/drawing/2016/5/11/chartex" xmlns:cx6="http://schemas.microsoft.com/office/drawing/2016/5/12/chartex" xmlns:cx7="http://schemas.microsoft.com/office/drawing/2016/5/13/chartex" xmlns:cx8="http://schemas.microsoft.com/office/drawing/2016/5/14/chartex" xmlns:mc="http://schemas.openxmlformats.org/markup-compatibility/2006" xmlns:aink="http://schemas.microsoft.com/office/drawing/2016/ink" xmlns:am3d="http://schemas.microsoft.com/office/drawing/2017/model3d" xmlns:o="urn:schemas-microsoft-com:office:office" xmlns:r="http://schemas.openxmlformats.org/officeDocument/2006/relationships" xmlns:m="http://schemas.openxmlformats.org/officeDocument/2006/math" xmlns:v="urn:schemas-microsoft-com:vml" xmlns:wp14="http://schemas.microsoft.com/office/word/2010/wordprocessingDrawing" xmlns:wp="http://schemas.openxmlformats.org/drawingml/2006/wordprocessingDrawing" xmlns:w10="urn:schemas-microsoft-com:office:word" xmlns:w="http://schemas.openxmlformats.org/wordprocessingml/2006/main" xmlns:w14="http://schemas.microsoft.com/office/word/2010/wordml" xmlns:w15="http://schemas.microsoft.com/office/word/2012/wordml" xmlns:w16cid="http://schemas.microsoft.com/office/word/2016/wordml/cid" xmlns:w16se="http://schemas.microsoft.com/office/word/2015/wordml/symex" xmlns:wpg="http://schemas.microsoft.com/office/word/2010/wordprocessingGroup" xmlns:wpi="http://schemas.microsoft.com/office/word/2010/wordprocessingInk" xmlns:wne="http://schemas.microsoft.com/office/word/2006/wordml" xmlns:wps="http://schemas.microsoft.com/office/word/2010/wordprocessingShape" mc:Ignorable="w14 w15 w16se w16cid wp14">
+  <w:abstractNum w:abstractNumId="0" w15:restartNumberingAfterBreak="0">
+    <w:nsid w:val="42102A94"/>
+    <w:multiLevelType w:val="multilevel"/>
+    <w:tmpl w:val="3B36CEB8"/>
+    <w:lvl w:ilvl="0">
+      <w:start w:val="1"/>
+      <w:numFmt w:val="bullet"/>
+      <w:lvlText w:val=""/>
+      <w:lvlJc w:val="left"/>
+      <w:pPr>
+        <w:tabs>
+          <w:tab w:val="num" w:pos="720"/>
+        </w:tabs>
+        <w:ind w:left="720" w:hanging="360"/>
+      </w:pPr>
+      <w:rPr>
+        <w:rFonts w:ascii="Symbol" w:hAnsi="Symbol" w:hint="default"/>
+        <w:sz w:val="20"/>
+      </w:rPr>
+    </w:lvl>
+    <w:lvl w:ilvl="1" w:tentative="1">
+      <w:start w:val="1"/>
+      <w:numFmt w:val="bullet"/>
+      <w:lvlText w:val="o"/>
+      <w:lvlJc w:val="left"/>
+      <w:pPr>
+        <w:tabs>
+          <w:tab w:val="num" w:pos="1440"/>
+        </w:tabs>
+        <w:ind w:left="1440" w:hanging="360"/>
+      </w:pPr>
+      <w:rPr>
+        <w:rFonts w:ascii="Courier New" w:hAnsi="Courier New" w:hint="default"/>
+        <w:sz w:val="20"/>
+      </w:rPr>
+    </w:lvl>
+    <w:lvl w:ilvl="2" w:tentative="1">
+      <w:start w:val="1"/>
+      <w:numFmt w:val="bullet"/>
+      <w:lvlText w:val=""/>
+      <w:lvlJc w:val="left"/>
+      <w:pPr>
+        <w:tabs>
+          <w:tab w:val="num" w:pos="2160"/>
+        </w:tabs>
+        <w:ind w:left="2160" w:hanging="360"/>
+      </w:pPr>
+      <w:rPr>
+        <w:rFonts w:ascii="Wingdings" w:hAnsi="Wingdings" w:hint="default"/>
+        <w:sz w:val="20"/>
+      </w:rPr>
+    </w:lvl>
+    <w:lvl w:ilvl="3" w:tentative="1">
+      <w:start w:val="1"/>
+      <w:numFmt w:val="bullet"/>
+      <w:lvlText w:val=""/>
+      <w:lvlJc w:val="left"/>
+      <w:pPr>
+        <w:tabs>
+          <w:tab w:val="num" w:pos="2880"/>
+        </w:tabs>
+        <w:ind w:left="2880" w:hanging="360"/>
+      </w:pPr>
+      <w:rPr>
+        <w:rFonts w:ascii="Wingdings" w:hAnsi="Wingdings" w:hint="default"/>
+        <w:sz w:val="20"/>
+      </w:rPr>
+    </w:lvl>
+    <w:lvl w:ilvl="4" w:tentative="1">
+      <w:start w:val="1"/>
+      <w:numFmt w:val="bullet"/>
+      <w:lvlText w:val=""/>
+      <w:lvlJc w:val="left"/>
+      <w:pPr>
+        <w:tabs>
+          <w:tab w:val="num" w:pos="3600"/>
+        </w:tabs>
+        <w:ind w:left="3600" w:hanging="360"/>
+      </w:pPr>
+      <w:rPr>
+        <w:rFonts w:ascii="Wingdings" w:hAnsi="Wingdings" w:hint="default"/>
+        <w:sz w:val="20"/>
+      </w:rPr>
+    </w:lvl>
+    <w:lvl w:ilvl="5" w:tentative="1">
+      <w:start w:val="1"/>
+      <w:numFmt w:val="bullet"/>
+      <w:lvlText w:val=""/>
+      <w:lvlJc w:val="left"/>
+      <w:pPr>
+        <w:tabs>
+          <w:tab w:val="num" w:pos="4320"/>
+        </w:tabs>
+        <w:ind w:left="4320" w:hanging="360"/>
+      </w:pPr>
+      <w:rPr>
+        <w:rFonts w:ascii="Wingdings" w:hAnsi="Wingdings" w:hint="default"/>
+        <w:sz w:val="20"/>
+      </w:rPr>
+    </w:lvl>
+    <w:lvl w:ilvl="6" w:tentative="1">
+      <w:start w:val="1"/>
+      <w:numFmt w:val="bullet"/>
+      <w:lvlText w:val=""/>
+      <w:lvlJc w:val="left"/>
+      <w:pPr>
+        <w:tabs>
+          <w:tab w:val="num" w:pos="5040"/>
+        </w:tabs>
+        <w:ind w:left="5040" w:hanging="360"/>
+      </w:pPr>
+      <w:rPr>
+        <w:rFonts w:ascii="Wingdings" w:hAnsi="Wingdings" w:hint="default"/>
+        <w:sz w:val="20"/>
+      </w:rPr>
+    </w:lvl>
+    <w:lvl w:ilvl="7" w:tentative="1">
+      <w:start w:val="1"/>
+      <w:numFmt w:val="bullet"/>
+      <w:lvlText w:val=""/>
+      <w:lvlJc w:val="left"/>
+      <w:pPr>
+        <w:tabs>
+          <w:tab w:val="num" w:pos="5760"/>
+        </w:tabs>
+        <w:ind w:left="5760" w:hanging="360"/>
+      </w:pPr>
+      <w:rPr>
+        <w:rFonts w:ascii="Wingdings" w:hAnsi="Wingdings" w:hint="default"/>
+        <w:sz w:val="20"/>
+      </w:rPr>
+    </w:lvl>
+    <w:lvl w:ilvl="8" w:tentative="1">
+      <w:start w:val="1"/>
+      <w:numFmt w:val="bullet"/>
+      <w:lvlText w:val=""/>
+      <w:lvlJc w:val="left"/>
+      <w:pPr>
+        <w:tabs>
+          <w:tab w:val="num" w:pos="6480"/>
+        </w:tabs>
+        <w:ind w:left="6480" w:hanging="360"/>
+      </w:pPr>
+      <w:rPr>
+        <w:rFonts w:ascii="Wingdings" w:hAnsi="Wingdings" w:hint="default"/>
+        <w:sz w:val="20"/>
+      </w:rPr>
+    </w:lvl>
+  </w:abstractNum>
+  <w:abstractNum w:abstractNumId="1" w15:restartNumberingAfterBreak="0">
+    <w:nsid w:val="5B935D36"/>
+    <w:multiLevelType w:val="multilevel"/>
+    <w:tmpl w:val="40C2A452"/>
+    <w:lvl w:ilvl="0">
+      <w:start w:val="1"/>
+      <w:numFmt w:val="decimal"/>
+      <w:lvlText w:val="%1."/>
+      <w:lvlJc w:val="left"/>
+      <w:pPr>
+        <w:tabs>
+          <w:tab w:val="num" w:pos="720"/>
+        </w:tabs>
+        <w:ind w:left="720" w:hanging="360"/>
+      </w:pPr>
+    </w:lvl>
+    <w:lvl w:ilvl="1" w:tentative="1">
+      <w:start w:val="1"/>
+      <w:numFmt w:val="decimal"/>
+      <w:lvlText w:val="%2."/>
+      <w:lvlJc w:val="left"/>
+      <w:pPr>
+        <w:tabs>
+          <w:tab w:val="num" w:pos="1440"/>
+        </w:tabs>
+        <w:ind w:left="1440" w:hanging="360"/>
+      </w:pPr>
+    </w:lvl>
+    <w:lvl w:ilvl="2" w:tentative="1">
+      <w:start w:val="1"/>
+      <w:numFmt w:val="decimal"/>
+      <w:lvlText w:val="%3."/>
+      <w:lvlJc w:val="left"/>
+      <w:pPr>
+        <w:tabs>
+          <w:tab w:val="num" w:pos="2160"/>
+        </w:tabs>
+        <w:ind w:left="2160" w:hanging="360"/>
+      </w:pPr>
+    </w:lvl>
+    <w:lvl w:ilvl="3" w:tentative="1">
+      <w:start w:val="1"/>
+      <w:numFmt w:val="decimal"/>
+      <w:lvlText w:val="%4."/>
+      <w:lvlJc w:val="left"/>
+      <w:pPr>
+        <w:tabs>
+          <w:tab w:val="num" w:pos="2880"/>
+        </w:tabs>
+        <w:ind w:left="2880" w:hanging="360"/>
+      </w:pPr>
+    </w:lvl>
+    <w:lvl w:ilvl="4" w:tentative="1">
+      <w:start w:val="1"/>
+      <w:numFmt w:val="decimal"/>
+      <w:lvlText w:val="%5."/>
+      <w:lvlJc w:val="left"/>
+      <w:pPr>
+        <w:tabs>
+          <w:tab w:val="num" w:pos="3600"/>
+        </w:tabs>
+        <w:ind w:left="3600" w:hanging="360"/>
+      </w:pPr>
+    </w:lvl>
+    <w:lvl w:ilvl="5" w:tentative="1">
+      <w:start w:val="1"/>
+      <w:numFmt w:val="decimal"/>
+      <w:lvlText w:val="%6."/>
+      <w:lvlJc w:val="left"/>
+      <w:pPr>
+        <w:tabs>
+          <w:tab w:val="num" w:pos="4320"/>
+        </w:tabs>
+        <w:ind w:left="4320" w:hanging="360"/>
+      </w:pPr>
+    </w:lvl>
+    <w:lvl w:ilvl="6" w:tentative="1">
+      <w:start w:val="1"/>
+      <w:numFmt w:val="decimal"/>
+      <w:lvlText w:val="%7."/>
+      <w:lvlJc w:val="left"/>
+      <w:pPr>
+        <w:tabs>
+          <w:tab w:val="num" w:pos="5040"/>
+        </w:tabs>
+        <w:ind w:left="5040" w:hanging="360"/>
+      </w:pPr>
+    </w:lvl>
+    <w:lvl w:ilvl="7" w:tentative="1">
+      <w:start w:val="1"/>
+      <w:numFmt w:val="decimal"/>
+      <w:lvlText w:val="%8."/>
+      <w:lvlJc w:val="left"/>
+      <w:pPr>
+        <w:tabs>
+          <w:tab w:val="num" w:pos="5760"/>
+        </w:tabs>
+        <w:ind w:left="5760" w:hanging="360"/>
+      </w:pPr>
+    </w:lvl>
+    <w:lvl w:ilvl="8" w:tentative="1">
+      <w:start w:val="1"/>
+      <w:numFmt w:val="decimal"/>
+      <w:lvlText w:val="%9."/>
+      <w:lvlJc w:val="left"/>
+      <w:pPr>
+        <w:tabs>
+          <w:tab w:val="num" w:pos="6480"/>
+        </w:tabs>
+        <w:ind w:left="6480" w:hanging="360"/>
+      </w:pPr>
+    </w:lvl>
+  </w:abstractNum>
+  <w:abstractNum w:abstractNumId="2" w15:restartNumberingAfterBreak="0">
+    <w:nsid w:val="63B55F00"/>
+    <w:multiLevelType w:val="multilevel"/>
+    <w:tmpl w:val="8614514A"/>
+    <w:lvl w:ilvl="0">
+      <w:start w:val="1"/>
+      <w:numFmt w:val="bullet"/>
+      <w:lvlText w:val=""/>
+      <w:lvlJc w:val="left"/>
+      <w:pPr>
+        <w:tabs>
+          <w:tab w:val="num" w:pos="720"/>
+        </w:tabs>
+        <w:ind w:left="720" w:hanging="360"/>
+      </w:pPr>
+      <w:rPr>
+        <w:rFonts w:ascii="Symbol" w:hAnsi="Symbol" w:hint="default"/>
+        <w:sz w:val="20"/>
+      </w:rPr>
+    </w:lvl>
+    <w:lvl w:ilvl="1" w:tentative="1">
+      <w:start w:val="1"/>
+      <w:numFmt w:val="bullet"/>
+      <w:lvlText w:val="o"/>
+      <w:lvlJc w:val="left"/>
+      <w:pPr>
+        <w:tabs>
+          <w:tab w:val="num" w:pos="1440"/>
+        </w:tabs>
+        <w:ind w:left="1440" w:hanging="360"/>
+      </w:pPr>
+      <w:rPr>
+        <w:rFonts w:ascii="Courier New" w:hAnsi="Courier New" w:hint="default"/>
+        <w:sz w:val="20"/>
+      </w:rPr>
+    </w:lvl>
+    <w:lvl w:ilvl="2" w:tentative="1">
+      <w:start w:val="1"/>
+      <w:numFmt w:val="bullet"/>
+      <w:lvlText w:val=""/>
+      <w:lvlJc w:val="left"/>
+      <w:pPr>
+        <w:tabs>
+          <w:tab w:val="num" w:pos="2160"/>
+        </w:tabs>
+        <w:ind w:left="2160" w:hanging="360"/>
+      </w:pPr>
+      <w:rPr>
+        <w:rFonts w:ascii="Wingdings" w:hAnsi="Wingdings" w:hint="default"/>
+        <w:sz w:val="20"/>
+      </w:rPr>
+    </w:lvl>
+    <w:lvl w:ilvl="3" w:tentative="1">
+      <w:start w:val="1"/>
+      <w:numFmt w:val="bullet"/>
+      <w:lvlText w:val=""/>
+      <w:lvlJc w:val="left"/>
+      <w:pPr>
+        <w:tabs>
+          <w:tab w:val="num" w:pos="2880"/>
+        </w:tabs>
+        <w:ind w:left="2880" w:hanging="360"/>
+      </w:pPr>
+      <w:rPr>
+        <w:rFonts w:ascii="Wingdings" w:hAnsi="Wingdings" w:hint="default"/>
+        <w:sz w:val="20"/>
+      </w:rPr>
+    </w:lvl>
+    <w:lvl w:ilvl="4" w:tentative="1">
+      <w:start w:val="1"/>
+      <w:numFmt w:val="bullet"/>
+      <w:lvlText w:val=""/>
+      <w:lvlJc w:val="left"/>
+      <w:pPr>
+        <w:tabs>
+          <w:tab w:val="num" w:pos="3600"/>
+        </w:tabs>
+        <w:ind w:left="3600" w:hanging="360"/>
+      </w:pPr>
+      <w:rPr>
+        <w:rFonts w:ascii="Wingdings" w:hAnsi="Wingdings" w:hint="default"/>
+        <w:sz w:val="20"/>
+      </w:rPr>
+    </w:lvl>
+    <w:lvl w:ilvl="5" w:tentative="1">
+      <w:start w:val="1"/>
+      <w:numFmt w:val="bullet"/>
+      <w:lvlText w:val=""/>
+      <w:lvlJc w:val="left"/>
+      <w:pPr>
+        <w:tabs>
+          <w:tab w:val="num" w:pos="4320"/>
+        </w:tabs>
+        <w:ind w:left="4320" w:hanging="360"/>
+      </w:pPr>
+      <w:rPr>
+        <w:rFonts w:ascii="Wingdings" w:hAnsi="Wingdings" w:hint="default"/>
+        <w:sz w:val="20"/>
+      </w:rPr>
+    </w:lvl>
+    <w:lvl w:ilvl="6" w:tentative="1">
+      <w:start w:val="1"/>
+      <w:numFmt w:val="bullet"/>
+      <w:lvlText w:val=""/>
+      <w:lvlJc w:val="left"/>
+      <w:pPr>
+        <w:tabs>
+          <w:tab w:val="num" w:pos="5040"/>
+        </w:tabs>
+        <w:ind w:left="5040" w:hanging="360"/>
+      </w:pPr>
+      <w:rPr>
+        <w:rFonts w:ascii="Wingdings" w:hAnsi="Wingdings" w:hint="default"/>
+        <w:sz w:val="20"/>
+      </w:rPr>
+    </w:lvl>
+    <w:lvl w:ilvl="7" w:tentative="1">
+      <w:start w:val="1"/>
+      <w:numFmt w:val="bullet"/>
+      <w:lvlText w:val=""/>
+      <w:lvlJc w:val="left"/>
+      <w:pPr>
+        <w:tabs>
+          <w:tab w:val="num" w:pos="5760"/>
+        </w:tabs>
+        <w:ind w:left="5760" w:hanging="360"/>
+      </w:pPr>
+      <w:rPr>
+        <w:rFonts w:ascii="Wingdings" w:hAnsi="Wingdings" w:hint="default"/>
+        <w:sz w:val="20"/>
+      </w:rPr>
+    </w:lvl>
+    <w:lvl w:ilvl="8" w:tentative="1">
+      <w:start w:val="1"/>
+      <w:numFmt w:val="bullet"/>
+      <w:lvlText w:val=""/>
+      <w:lvlJc w:val="left"/>
+      <w:pPr>
+        <w:tabs>
+          <w:tab w:val="num" w:pos="6480"/>
+        </w:tabs>
+        <w:ind w:left="6480" w:hanging="360"/>
+      </w:pPr>
+      <w:rPr>
+        <w:rFonts w:ascii="Wingdings" w:hAnsi="Wingdings" w:hint="default"/>
+        <w:sz w:val="20"/>
+      </w:rPr>
+    </w:lvl>
+  </w:abstractNum>
+  <w:abstractNum w:abstractNumId="3" w15:restartNumberingAfterBreak="0">
+    <w:nsid w:val="7EFC59DE"/>
+    <w:multiLevelType w:val="multilevel"/>
+    <w:tmpl w:val="BB949552"/>
+    <w:lvl w:ilvl="0">
+      <w:start w:val="1"/>
+      <w:numFmt w:val="bullet"/>
+      <w:lvlText w:val=""/>
+      <w:lvlJc w:val="left"/>
+      <w:pPr>
+        <w:tabs>
+          <w:tab w:val="num" w:pos="720"/>
+        </w:tabs>
+        <w:ind w:left="720" w:hanging="360"/>
+      </w:pPr>
+      <w:rPr>
+        <w:rFonts w:ascii="Symbol" w:hAnsi="Symbol" w:hint="default"/>
+        <w:sz w:val="20"/>
+      </w:rPr>
+    </w:lvl>
+    <w:lvl w:ilvl="1" w:tentative="1">
+      <w:start w:val="1"/>
+      <w:numFmt w:val="bullet"/>
+      <w:lvlText w:val="o"/>
+      <w:lvlJc w:val="left"/>
+      <w:pPr>
+        <w:tabs>
+          <w:tab w:val="num" w:pos="1440"/>
+        </w:tabs>
+        <w:ind w:left="1440" w:hanging="360"/>
+      </w:pPr>
+      <w:rPr>
+        <w:rFonts w:ascii="Courier New" w:hAnsi="Courier New" w:hint="default"/>
+        <w:sz w:val="20"/>
+      </w:rPr>
+    </w:lvl>
+    <w:lvl w:ilvl="2" w:tentative="1">
+      <w:start w:val="1"/>
+      <w:numFmt w:val="bullet"/>
+      <w:lvlText w:val=""/>
+      <w:lvlJc w:val="left"/>
+      <w:pPr>
+        <w:tabs>
+          <w:tab w:val="num" w:pos="2160"/>
+        </w:tabs>
+        <w:ind w:left="2160" w:hanging="360"/>
+      </w:pPr>
+      <w:rPr>
+        <w:rFonts w:ascii="Wingdings" w:hAnsi="Wingdings" w:hint="default"/>
+        <w:sz w:val="20"/>
+      </w:rPr>
+    </w:lvl>
+    <w:lvl w:ilvl="3" w:tentative="1">
+      <w:start w:val="1"/>
+      <w:numFmt w:val="bullet"/>
+      <w:lvlText w:val=""/>
+      <w:lvlJc w:val="left"/>
+      <w:pPr>
+        <w:tabs>
+          <w:tab w:val="num" w:pos="2880"/>
+        </w:tabs>
+        <w:ind w:left="2880" w:hanging="360"/>
+      </w:pPr>
+      <w:rPr>
+        <w:rFonts w:ascii="Wingdings" w:hAnsi="Wingdings" w:hint="default"/>
+        <w:sz w:val="20"/>
+      </w:rPr>
+    </w:lvl>
+    <w:lvl w:ilvl="4" w:tentative="1">
+      <w:start w:val="1"/>
+      <w:numFmt w:val="bullet"/>
+      <w:lvlText w:val=""/>
+      <w:lvlJc w:val="left"/>
+      <w:pPr>
+        <w:tabs>
+          <w:tab w:val="num" w:pos="3600"/>
+        </w:tabs>
+        <w:ind w:left="3600" w:hanging="360"/>
+      </w:pPr>
+      <w:rPr>
+        <w:rFonts w:ascii="Wingdings" w:hAnsi="Wingdings" w:hint="default"/>
+        <w:sz w:val="20"/>
+      </w:rPr>
+    </w:lvl>
+    <w:lvl w:ilvl="5" w:tentative="1">
+      <w:start w:val="1"/>
+      <w:numFmt w:val="bullet"/>
+      <w:lvlText w:val=""/>
+      <w:lvlJc w:val="left"/>
+      <w:pPr>
+        <w:tabs>
+          <w:tab w:val="num" w:pos="4320"/>
+        </w:tabs>
+        <w:ind w:left="4320" w:hanging="360"/>
+      </w:pPr>
+      <w:rPr>
+        <w:rFonts w:ascii="Wingdings" w:hAnsi="Wingdings" w:hint="default"/>
+        <w:sz w:val="20"/>
+      </w:rPr>
+    </w:lvl>
+    <w:lvl w:ilvl="6" w:tentative="1">
+      <w:start w:val="1"/>
+      <w:numFmt w:val="bullet"/>
+      <w:lvlText w:val=""/>
+      <w:lvlJc w:val="left"/>
+      <w:pPr>
+        <w:tabs>
+          <w:tab w:val="num" w:pos="5040"/>
+        </w:tabs>
+        <w:ind w:left="5040" w:hanging="360"/>
+      </w:pPr>
+      <w:rPr>
+        <w:rFonts w:ascii="Wingdings" w:hAnsi="Wingdings" w:hint="default"/>
+        <w:sz w:val="20"/>
+      </w:rPr>
+    </w:lvl>
+    <w:lvl w:ilvl="7" w:tentative="1">
+      <w:start w:val="1"/>
+      <w:numFmt w:val="bullet"/>
+      <w:lvlText w:val=""/>
+      <w:lvlJc w:val="left"/>
+      <w:pPr>
+        <w:tabs>
+          <w:tab w:val="num" w:pos="5760"/>
+        </w:tabs>
+        <w:ind w:left="5760" w:hanging="360"/>
+      </w:pPr>
+      <w:rPr>
+        <w:rFonts w:ascii="Wingdings" w:hAnsi="Wingdings" w:hint="default"/>
+        <w:sz w:val="20"/>
+      </w:rPr>
+    </w:lvl>
+    <w:lvl w:ilvl="8" w:tentative="1">
+      <w:start w:val="1"/>
+      <w:numFmt w:val="bullet"/>
+      <w:lvlText w:val=""/>
+      <w:lvlJc w:val="left"/>
+      <w:pPr>
+        <w:tabs>
+          <w:tab w:val="num" w:pos="6480"/>
+        </w:tabs>
+        <w:ind w:left="6480" w:hanging="360"/>
+      </w:pPr>
+      <w:rPr>
+        <w:rFonts w:ascii="Wingdings" w:hAnsi="Wingdings" w:hint="default"/>
+        <w:sz w:val="20"/>
+      </w:rPr>
+    </w:lvl>
+  </w:abstractNum>
+  <w:num w:numId="1">
+    <w:abstractNumId w:val="0"/>
+  </w:num>
+  <w:num w:numId="2">
+    <w:abstractNumId w:val="2"/>
+  </w:num>
+  <w:num w:numId="3">
+    <w:abstractNumId w:val="3"/>
+  </w:num>
+  <w:num w:numId="4">
+    <w:abstractNumId w:val="1"/>
+  </w:num>
+</w:numbering>
 </file>
 
 <file path=word/styles.xml><?xml version="1.0" encoding="utf-8"?>
@@ -1146,6 +2619,22 @@
       <w:szCs w:val="20"/>
     </w:rPr>
   </w:style>
+  <w:style w:type="paragraph" w:styleId="NormalWeb">
+    <w:name w:val="Normal (Web)"/>
+    <w:basedOn w:val="Normal"/>
+    <w:uiPriority w:val="99"/>
+    <w:semiHidden/>
+    <w:unhideWhenUsed/>
+    <w:rsid w:val="00487702"/>
+    <w:pPr>
+      <w:spacing w:before="100" w:beforeAutospacing="1" w:after="100" w:afterAutospacing="1" w:line="240" w:lineRule="auto"/>
+    </w:pPr>
+    <w:rPr>
+      <w:rFonts w:ascii="Times New Roman" w:eastAsia="Times New Roman" w:hAnsi="Times New Roman" w:cs="Times New Roman"/>
+      <w:sz w:val="24"/>
+      <w:szCs w:val="24"/>
+    </w:rPr>
+  </w:style>
 </w:styles>
 </file>
 

</xml_diff>